<commit_message>
add regex char chir mucj
</commit_message>
<xml_diff>
--- a/document/gan_chuan.docx
+++ b/document/gan_chuan.docx
@@ -59,7 +59,7 @@
           <w:noProof/>
         </w:rPr>
         <w:pict w14:anchorId="14208D58">
-          <v:rect id="_x0000_i1030" alt="" style="width:420.25pt;height:.05pt;mso-width-percent:0;mso-height-percent:0;mso-width-percent:0;mso-height-percent:0" o:hrpct="898" o:hralign="center" o:hrstd="t" o:hr="t" fillcolor="#a0a0a0" stroked="f"/>
+          <v:rect id="_x0000_i1030" alt="" style="width:405.3pt;height:.05pt;mso-width-percent:0;mso-height-percent:0;mso-width-percent:0;mso-height-percent:0" o:hrpct="866" o:hralign="center" o:hrstd="t" o:hr="t" fillcolor="#a0a0a0" stroked="f"/>
         </w:pict>
       </w:r>
     </w:p>
@@ -121,8 +121,16 @@
         <w:rPr>
           <w:bCs/>
           <w:color w:val="1B1C1D"/>
-        </w:rPr>
-        <w:t>1.1 Lịch sử phát triển của AI</w:t>
+          <w:lang w:val="vi-VN"/>
+        </w:rPr>
+        <w:t>a.</w:t>
+      </w:r>
+      <w:r>
+        <w:rPr>
+          <w:bCs/>
+          <w:color w:val="1B1C1D"/>
+        </w:rPr>
+        <w:t xml:space="preserve"> Lịch sử phát triển của AI</w:t>
       </w:r>
     </w:p>
     <w:p>
@@ -143,16 +151,24 @@
       <w:pPr>
         <w:spacing w:after="120"/>
         <w:rPr>
-          <w:b/>
-          <w:color w:val="1B1C1D"/>
-        </w:rPr>
-      </w:pPr>
-      <w:r>
-        <w:rPr>
-          <w:b/>
-          <w:color w:val="1B1C1D"/>
-        </w:rPr>
-        <w:t>1.1.1 Giai đoạn sơ khai (1940 - 1956)</w:t>
+          <w:bCs/>
+          <w:color w:val="1B1C1D"/>
+        </w:rPr>
+      </w:pPr>
+      <w:r>
+        <w:rPr>
+          <w:bCs/>
+          <w:color w:val="1B1C1D"/>
+          <w:lang w:val="vi-VN"/>
+        </w:rPr>
+        <w:t>a.a.a</w:t>
+      </w:r>
+      <w:r>
+        <w:rPr>
+          <w:bCs/>
+          <w:color w:val="1B1C1D"/>
+        </w:rPr>
+        <w:t xml:space="preserve"> Giai đoạn sơ khai (1940 - 1956)</w:t>
       </w:r>
     </w:p>
     <w:p>
@@ -2419,7 +2435,7 @@
           <w:noProof/>
         </w:rPr>
         <w:pict w14:anchorId="3D3BE525">
-          <v:rect id="_x0000_i1029" alt="" style="width:451.6pt;height:.05pt;mso-width-percent:0;mso-height-percent:0;mso-width-percent:0;mso-height-percent:0" o:hrpct="965" o:hralign="center" o:hrstd="t" o:hr="t" fillcolor="#a0a0a0" stroked="f"/>
+          <v:rect id="_x0000_i1029" alt="" style="width:468pt;height:.05pt;mso-width-percent:0;mso-height-percent:0;mso-width-percent:0;mso-height-percent:0" o:hralign="center" o:hrstd="t" o:hr="t" fillcolor="#a0a0a0" stroked="f"/>
         </w:pict>
       </w:r>
     </w:p>
@@ -4458,7 +4474,7 @@
           <w:noProof/>
         </w:rPr>
         <w:pict w14:anchorId="52D65A16">
-          <v:rect id="_x0000_i1028" alt="" style="width:451.6pt;height:.05pt;mso-width-percent:0;mso-height-percent:0;mso-width-percent:0;mso-height-percent:0" o:hrpct="965" o:hralign="center" o:hrstd="t" o:hr="t" fillcolor="#a0a0a0" stroked="f"/>
+          <v:rect id="_x0000_i1028" alt="" style="width:468pt;height:.05pt;mso-width-percent:0;mso-height-percent:0;mso-width-percent:0;mso-height-percent:0" o:hralign="center" o:hrstd="t" o:hr="t" fillcolor="#a0a0a0" stroked="f"/>
         </w:pict>
       </w:r>
     </w:p>
@@ -4529,7 +4545,7 @@
           <w:noProof/>
         </w:rPr>
         <w:pict w14:anchorId="4771CA9A">
-          <v:rect id="_x0000_i1027" alt="" style="width:451.6pt;height:.05pt;mso-width-percent:0;mso-height-percent:0;mso-width-percent:0;mso-height-percent:0" o:hrpct="965" o:hralign="center" o:hrstd="t" o:hr="t" fillcolor="#a0a0a0" stroked="f"/>
+          <v:rect id="_x0000_i1027" alt="" style="width:468pt;height:.05pt;mso-width-percent:0;mso-height-percent:0;mso-width-percent:0;mso-height-percent:0" o:hralign="center" o:hrstd="t" o:hr="t" fillcolor="#a0a0a0" stroked="f"/>
         </w:pict>
       </w:r>
     </w:p>
@@ -6165,7 +6181,7 @@
           <w:noProof/>
         </w:rPr>
         <w:pict w14:anchorId="1BD16FDA">
-          <v:rect id="_x0000_i1026" alt="" style="width:451.6pt;height:.05pt;mso-width-percent:0;mso-height-percent:0;mso-width-percent:0;mso-height-percent:0" o:hrpct="965" o:hralign="center" o:hrstd="t" o:hr="t" fillcolor="#a0a0a0" stroked="f"/>
+          <v:rect id="_x0000_i1026" alt="" style="width:468pt;height:.05pt;mso-width-percent:0;mso-height-percent:0;mso-width-percent:0;mso-height-percent:0" o:hralign="center" o:hrstd="t" o:hr="t" fillcolor="#a0a0a0" stroked="f"/>
         </w:pict>
       </w:r>
     </w:p>
@@ -6180,7 +6196,7 @@
           <w:noProof/>
         </w:rPr>
         <w:pict w14:anchorId="7E775F76">
-          <v:rect id="_x0000_i1025" alt="" style="width:451.6pt;height:.05pt;mso-width-percent:0;mso-height-percent:0;mso-width-percent:0;mso-height-percent:0" o:hrpct="965" o:hralign="center" o:hrstd="t" o:hr="t" fillcolor="#a0a0a0" stroked="f"/>
+          <v:rect id="_x0000_i1025" alt="" style="width:468pt;height:.05pt;mso-width-percent:0;mso-height-percent:0;mso-width-percent:0;mso-height-percent:0" o:hralign="center" o:hrstd="t" o:hr="t" fillcolor="#a0a0a0" stroked="f"/>
         </w:pict>
       </w:r>
     </w:p>

</xml_diff>